<commit_message>
Add md-docx-transform skill + center template tables
- New skill md-docx-transform: Pandoc Markdown→DOCX pipeline with sample-table
  property cloning (clone_table_props.py) to inject template style as direct
  formatting, plus --center-tables and --override-jc options.
- Patch reference_template.docx sample table tblPr with <w:jc val="center"/>
  so cloned output tables center naturally without the flag.
- Refresh extract-docx-styles SKILL guide.

Co-Authored-By: Claude Opus 4.7 (1M context) <noreply@anthropic.com>
</commit_message>
<xml_diff>
--- a/references/templates/reference_template.docx
+++ b/references/templates/reference_template.docx
@@ -5,22 +5,18 @@
     <w:p>
       <w:pPr>
         <w:pStyle w:val="1"/>
-        <w:rPr>
-          <w:b/>
-          <w:bCs/>
-          <w:sz w:val="28"/>
-          <w:szCs w:val="32"/>
-        </w:rPr>
       </w:pPr>
       <w:r>
         <w:rPr>
           <w:rFonts w:hint="eastAsia"/>
-          <w:b/>
-          <w:bCs/>
-          <w:sz w:val="28"/>
-          <w:szCs w:val="32"/>
         </w:rPr>
-        <w:t>선급등록 및 검사</w:t>
+        <w:t>선급등록</w:t>
+      </w:r>
+      <w:r>
+        <w:rPr>
+          <w:rFonts w:hint="eastAsia"/>
+        </w:rPr>
+        <w:t xml:space="preserve"> 및 검사</w:t>
       </w:r>
     </w:p>
     <w:p>
@@ -75,7 +71,13 @@
         <w:rPr>
           <w:rFonts w:hint="eastAsia"/>
         </w:rPr>
-        <w:t>규칙이라 함은 우리</w:t>
+        <w:t>규칙이라</w:t>
+      </w:r>
+      <w:r>
+        <w:rPr>
+          <w:rFonts w:hint="eastAsia"/>
+        </w:rPr>
+        <w:t xml:space="preserve"> 함은 우리</w:t>
       </w:r>
     </w:p>
     <w:p/>
@@ -83,14 +85,23 @@
       <w:tblPr>
         <w:tblStyle w:val="aa"/>
         <w:tblW w:w="0" w:type="auto"/>
+        <w:tblBorders>
+          <w:top w:val="single" w:sz="12" w:space="0" w:color="auto"/>
+          <w:left w:val="single" w:sz="12" w:space="0" w:color="auto"/>
+          <w:bottom w:val="single" w:sz="12" w:space="0" w:color="auto"/>
+          <w:right w:val="single" w:sz="12" w:space="0" w:color="auto"/>
+          <w:insideH w:val="single" w:sz="4" w:space="0" w:color="auto"/>
+          <w:insideV w:val="single" w:sz="4" w:space="0" w:color="auto"/>
+        </w:tblBorders>
         <w:tblLook w:val="04A0" w:firstRow="1" w:lastRow="0" w:firstColumn="1" w:lastColumn="0" w:noHBand="0" w:noVBand="1"/>
+        <w:jc w:val="center"/>
       </w:tblPr>
       <w:tblGrid>
-        <w:gridCol w:w="1795"/>
-        <w:gridCol w:w="1796"/>
-        <w:gridCol w:w="1796"/>
-        <w:gridCol w:w="1796"/>
-        <w:gridCol w:w="1797"/>
+        <w:gridCol w:w="1799"/>
+        <w:gridCol w:w="1799"/>
+        <w:gridCol w:w="1799"/>
+        <w:gridCol w:w="1799"/>
+        <w:gridCol w:w="1800"/>
       </w:tblGrid>
       <w:tr>
         <w:trPr>
@@ -101,16 +112,13 @@
             <w:cnfStyle w:val="001000000000" w:firstRow="0" w:lastRow="0" w:firstColumn="1" w:lastColumn="0" w:oddVBand="0" w:evenVBand="0" w:oddHBand="0" w:evenHBand="0" w:firstRowFirstColumn="0" w:firstRowLastColumn="0" w:lastRowFirstColumn="0" w:lastRowLastColumn="0"/>
             <w:tcW w:w="1803" w:type="dxa"/>
           </w:tcPr>
-          <w:p/>
-        </w:tc>
-        <w:tc>
-          <w:tcPr>
-            <w:tcW w:w="1803" w:type="dxa"/>
-          </w:tcPr>
           <w:p>
-            <w:pPr>
-              <w:cnfStyle w:val="100000000000" w:firstRow="1" w:lastRow="0" w:firstColumn="0" w:lastColumn="0" w:oddVBand="0" w:evenVBand="0" w:oddHBand="0" w:evenHBand="0" w:firstRowFirstColumn="0" w:firstRowLastColumn="0" w:lastRowFirstColumn="0" w:lastRowLastColumn="0"/>
-            </w:pPr>
+            <w:r>
+              <w:rPr>
+                <w:rFonts w:hint="eastAsia"/>
+              </w:rPr>
+              <w:t>번호</w:t>
+            </w:r>
           </w:p>
         </w:tc>
         <w:tc>
@@ -121,6 +129,12 @@
             <w:pPr>
               <w:cnfStyle w:val="100000000000" w:firstRow="1" w:lastRow="0" w:firstColumn="0" w:lastColumn="0" w:oddVBand="0" w:evenVBand="0" w:oddHBand="0" w:evenHBand="0" w:firstRowFirstColumn="0" w:firstRowLastColumn="0" w:lastRowFirstColumn="0" w:lastRowLastColumn="0"/>
             </w:pPr>
+            <w:r>
+              <w:rPr>
+                <w:rFonts w:hint="eastAsia"/>
+              </w:rPr>
+              <w:t>타입A</w:t>
+            </w:r>
           </w:p>
         </w:tc>
         <w:tc>
@@ -131,6 +145,28 @@
             <w:pPr>
               <w:cnfStyle w:val="100000000000" w:firstRow="1" w:lastRow="0" w:firstColumn="0" w:lastColumn="0" w:oddVBand="0" w:evenVBand="0" w:oddHBand="0" w:evenHBand="0" w:firstRowFirstColumn="0" w:firstRowLastColumn="0" w:lastRowFirstColumn="0" w:lastRowLastColumn="0"/>
             </w:pPr>
+            <w:r>
+              <w:rPr>
+                <w:rFonts w:hint="eastAsia"/>
+              </w:rPr>
+              <w:t>타입B</w:t>
+            </w:r>
+          </w:p>
+        </w:tc>
+        <w:tc>
+          <w:tcPr>
+            <w:tcW w:w="1803" w:type="dxa"/>
+          </w:tcPr>
+          <w:p>
+            <w:pPr>
+              <w:cnfStyle w:val="100000000000" w:firstRow="1" w:lastRow="0" w:firstColumn="0" w:lastColumn="0" w:oddVBand="0" w:evenVBand="0" w:oddHBand="0" w:evenHBand="0" w:firstRowFirstColumn="0" w:firstRowLastColumn="0" w:lastRowFirstColumn="0" w:lastRowLastColumn="0"/>
+            </w:pPr>
+            <w:r>
+              <w:rPr>
+                <w:rFonts w:hint="eastAsia"/>
+              </w:rPr>
+              <w:t>타입C</w:t>
+            </w:r>
           </w:p>
         </w:tc>
         <w:tc>
@@ -141,6 +177,12 @@
             <w:pPr>
               <w:cnfStyle w:val="100000000000" w:firstRow="1" w:lastRow="0" w:firstColumn="0" w:lastColumn="0" w:oddVBand="0" w:evenVBand="0" w:oddHBand="0" w:evenHBand="0" w:firstRowFirstColumn="0" w:firstRowLastColumn="0" w:lastRowFirstColumn="0" w:lastRowLastColumn="0"/>
             </w:pPr>
+            <w:r>
+              <w:rPr>
+                <w:rFonts w:hint="eastAsia"/>
+              </w:rPr>
+              <w:t>타입D</w:t>
+            </w:r>
           </w:p>
         </w:tc>
       </w:tr>
@@ -150,16 +192,13 @@
             <w:cnfStyle w:val="001000000000" w:firstRow="0" w:lastRow="0" w:firstColumn="1" w:lastColumn="0" w:oddVBand="0" w:evenVBand="0" w:oddHBand="0" w:evenHBand="0" w:firstRowFirstColumn="0" w:firstRowLastColumn="0" w:lastRowFirstColumn="0" w:lastRowLastColumn="0"/>
             <w:tcW w:w="1803" w:type="dxa"/>
           </w:tcPr>
-          <w:p/>
-        </w:tc>
-        <w:tc>
-          <w:tcPr>
-            <w:tcW w:w="1803" w:type="dxa"/>
-          </w:tcPr>
           <w:p>
-            <w:pPr>
-              <w:cnfStyle w:val="000000000000" w:firstRow="0" w:lastRow="0" w:firstColumn="0" w:lastColumn="0" w:oddVBand="0" w:evenVBand="0" w:oddHBand="0" w:evenHBand="0" w:firstRowFirstColumn="0" w:firstRowLastColumn="0" w:lastRowFirstColumn="0" w:lastRowLastColumn="0"/>
-            </w:pPr>
+            <w:r>
+              <w:rPr>
+                <w:rFonts w:hint="eastAsia"/>
+              </w:rPr>
+              <w:t>모터</w:t>
+            </w:r>
           </w:p>
         </w:tc>
         <w:tc>
@@ -170,6 +209,12 @@
             <w:pPr>
               <w:cnfStyle w:val="000000000000" w:firstRow="0" w:lastRow="0" w:firstColumn="0" w:lastColumn="0" w:oddVBand="0" w:evenVBand="0" w:oddHBand="0" w:evenHBand="0" w:firstRowFirstColumn="0" w:firstRowLastColumn="0" w:lastRowFirstColumn="0" w:lastRowLastColumn="0"/>
             </w:pPr>
+            <w:r>
+              <w:rPr>
+                <w:rFonts w:hint="eastAsia"/>
+              </w:rPr>
+              <w:t>234</w:t>
+            </w:r>
           </w:p>
         </w:tc>
         <w:tc>
@@ -180,6 +225,28 @@
             <w:pPr>
               <w:cnfStyle w:val="000000000000" w:firstRow="0" w:lastRow="0" w:firstColumn="0" w:lastColumn="0" w:oddVBand="0" w:evenVBand="0" w:oddHBand="0" w:evenHBand="0" w:firstRowFirstColumn="0" w:firstRowLastColumn="0" w:lastRowFirstColumn="0" w:lastRowLastColumn="0"/>
             </w:pPr>
+            <w:r>
+              <w:rPr>
+                <w:rFonts w:hint="eastAsia"/>
+              </w:rPr>
+              <w:t>34</w:t>
+            </w:r>
+          </w:p>
+        </w:tc>
+        <w:tc>
+          <w:tcPr>
+            <w:tcW w:w="1803" w:type="dxa"/>
+          </w:tcPr>
+          <w:p>
+            <w:pPr>
+              <w:cnfStyle w:val="000000000000" w:firstRow="0" w:lastRow="0" w:firstColumn="0" w:lastColumn="0" w:oddVBand="0" w:evenVBand="0" w:oddHBand="0" w:evenHBand="0" w:firstRowFirstColumn="0" w:firstRowLastColumn="0" w:lastRowFirstColumn="0" w:lastRowLastColumn="0"/>
+            </w:pPr>
+            <w:r>
+              <w:rPr>
+                <w:rFonts w:hint="eastAsia"/>
+              </w:rPr>
+              <w:t>6</w:t>
+            </w:r>
           </w:p>
         </w:tc>
         <w:tc>
@@ -190,6 +257,12 @@
             <w:pPr>
               <w:cnfStyle w:val="000000000000" w:firstRow="0" w:lastRow="0" w:firstColumn="0" w:lastColumn="0" w:oddVBand="0" w:evenVBand="0" w:oddHBand="0" w:evenHBand="0" w:firstRowFirstColumn="0" w:firstRowLastColumn="0" w:lastRowFirstColumn="0" w:lastRowLastColumn="0"/>
             </w:pPr>
+            <w:r>
+              <w:rPr>
+                <w:rFonts w:hint="eastAsia"/>
+              </w:rPr>
+              <w:t>44</w:t>
+            </w:r>
           </w:p>
         </w:tc>
       </w:tr>
@@ -199,16 +272,13 @@
             <w:cnfStyle w:val="001000000000" w:firstRow="0" w:lastRow="0" w:firstColumn="1" w:lastColumn="0" w:oddVBand="0" w:evenVBand="0" w:oddHBand="0" w:evenHBand="0" w:firstRowFirstColumn="0" w:firstRowLastColumn="0" w:lastRowFirstColumn="0" w:lastRowLastColumn="0"/>
             <w:tcW w:w="1803" w:type="dxa"/>
           </w:tcPr>
-          <w:p/>
-        </w:tc>
-        <w:tc>
-          <w:tcPr>
-            <w:tcW w:w="1803" w:type="dxa"/>
-          </w:tcPr>
           <w:p>
-            <w:pPr>
-              <w:cnfStyle w:val="000000000000" w:firstRow="0" w:lastRow="0" w:firstColumn="0" w:lastColumn="0" w:oddVBand="0" w:evenVBand="0" w:oddHBand="0" w:evenHBand="0" w:firstRowFirstColumn="0" w:firstRowLastColumn="0" w:lastRowFirstColumn="0" w:lastRowLastColumn="0"/>
-            </w:pPr>
+            <w:r>
+              <w:rPr>
+                <w:rFonts w:hint="eastAsia"/>
+              </w:rPr>
+              <w:t>엔진</w:t>
+            </w:r>
           </w:p>
         </w:tc>
         <w:tc>
@@ -219,6 +289,12 @@
             <w:pPr>
               <w:cnfStyle w:val="000000000000" w:firstRow="0" w:lastRow="0" w:firstColumn="0" w:lastColumn="0" w:oddVBand="0" w:evenVBand="0" w:oddHBand="0" w:evenHBand="0" w:firstRowFirstColumn="0" w:firstRowLastColumn="0" w:lastRowFirstColumn="0" w:lastRowLastColumn="0"/>
             </w:pPr>
+            <w:r>
+              <w:rPr>
+                <w:rFonts w:hint="eastAsia"/>
+              </w:rPr>
+              <w:t>3</w:t>
+            </w:r>
           </w:p>
         </w:tc>
         <w:tc>
@@ -229,6 +305,28 @@
             <w:pPr>
               <w:cnfStyle w:val="000000000000" w:firstRow="0" w:lastRow="0" w:firstColumn="0" w:lastColumn="0" w:oddVBand="0" w:evenVBand="0" w:oddHBand="0" w:evenHBand="0" w:firstRowFirstColumn="0" w:firstRowLastColumn="0" w:lastRowFirstColumn="0" w:lastRowLastColumn="0"/>
             </w:pPr>
+            <w:r>
+              <w:rPr>
+                <w:rFonts w:hint="eastAsia"/>
+              </w:rPr>
+              <w:t>234</w:t>
+            </w:r>
+          </w:p>
+        </w:tc>
+        <w:tc>
+          <w:tcPr>
+            <w:tcW w:w="1803" w:type="dxa"/>
+          </w:tcPr>
+          <w:p>
+            <w:pPr>
+              <w:cnfStyle w:val="000000000000" w:firstRow="0" w:lastRow="0" w:firstColumn="0" w:lastColumn="0" w:oddVBand="0" w:evenVBand="0" w:oddHBand="0" w:evenHBand="0" w:firstRowFirstColumn="0" w:firstRowLastColumn="0" w:lastRowFirstColumn="0" w:lastRowLastColumn="0"/>
+            </w:pPr>
+            <w:r>
+              <w:rPr>
+                <w:rFonts w:hint="eastAsia"/>
+              </w:rPr>
+              <w:t>56</w:t>
+            </w:r>
           </w:p>
         </w:tc>
         <w:tc>
@@ -239,6 +337,12 @@
             <w:pPr>
               <w:cnfStyle w:val="000000000000" w:firstRow="0" w:lastRow="0" w:firstColumn="0" w:lastColumn="0" w:oddVBand="0" w:evenVBand="0" w:oddHBand="0" w:evenHBand="0" w:firstRowFirstColumn="0" w:firstRowLastColumn="0" w:lastRowFirstColumn="0" w:lastRowLastColumn="0"/>
             </w:pPr>
+            <w:r>
+              <w:rPr>
+                <w:rFonts w:hint="eastAsia"/>
+              </w:rPr>
+              <w:t>56</w:t>
+            </w:r>
           </w:p>
         </w:tc>
       </w:tr>
@@ -248,16 +352,13 @@
             <w:cnfStyle w:val="001000000000" w:firstRow="0" w:lastRow="0" w:firstColumn="1" w:lastColumn="0" w:oddVBand="0" w:evenVBand="0" w:oddHBand="0" w:evenHBand="0" w:firstRowFirstColumn="0" w:firstRowLastColumn="0" w:lastRowFirstColumn="0" w:lastRowLastColumn="0"/>
             <w:tcW w:w="1803" w:type="dxa"/>
           </w:tcPr>
-          <w:p/>
-        </w:tc>
-        <w:tc>
-          <w:tcPr>
-            <w:tcW w:w="1803" w:type="dxa"/>
-          </w:tcPr>
           <w:p>
-            <w:pPr>
-              <w:cnfStyle w:val="000000000000" w:firstRow="0" w:lastRow="0" w:firstColumn="0" w:lastColumn="0" w:oddVBand="0" w:evenVBand="0" w:oddHBand="0" w:evenHBand="0" w:firstRowFirstColumn="0" w:firstRowLastColumn="0" w:lastRowFirstColumn="0" w:lastRowLastColumn="0"/>
-            </w:pPr>
+            <w:r>
+              <w:rPr>
+                <w:rFonts w:hint="eastAsia"/>
+              </w:rPr>
+              <w:t>항해</w:t>
+            </w:r>
           </w:p>
         </w:tc>
         <w:tc>
@@ -268,6 +369,12 @@
             <w:pPr>
               <w:cnfStyle w:val="000000000000" w:firstRow="0" w:lastRow="0" w:firstColumn="0" w:lastColumn="0" w:oddVBand="0" w:evenVBand="0" w:oddHBand="0" w:evenHBand="0" w:firstRowFirstColumn="0" w:firstRowLastColumn="0" w:lastRowFirstColumn="0" w:lastRowLastColumn="0"/>
             </w:pPr>
+            <w:r>
+              <w:rPr>
+                <w:rFonts w:hint="eastAsia"/>
+              </w:rPr>
+              <w:t>234</w:t>
+            </w:r>
           </w:p>
         </w:tc>
         <w:tc>
@@ -278,6 +385,28 @@
             <w:pPr>
               <w:cnfStyle w:val="000000000000" w:firstRow="0" w:lastRow="0" w:firstColumn="0" w:lastColumn="0" w:oddVBand="0" w:evenVBand="0" w:oddHBand="0" w:evenHBand="0" w:firstRowFirstColumn="0" w:firstRowLastColumn="0" w:lastRowFirstColumn="0" w:lastRowLastColumn="0"/>
             </w:pPr>
+            <w:r>
+              <w:rPr>
+                <w:rFonts w:hint="eastAsia"/>
+              </w:rPr>
+              <w:t>54</w:t>
+            </w:r>
+          </w:p>
+        </w:tc>
+        <w:tc>
+          <w:tcPr>
+            <w:tcW w:w="1803" w:type="dxa"/>
+          </w:tcPr>
+          <w:p>
+            <w:pPr>
+              <w:cnfStyle w:val="000000000000" w:firstRow="0" w:lastRow="0" w:firstColumn="0" w:lastColumn="0" w:oddVBand="0" w:evenVBand="0" w:oddHBand="0" w:evenHBand="0" w:firstRowFirstColumn="0" w:firstRowLastColumn="0" w:lastRowFirstColumn="0" w:lastRowLastColumn="0"/>
+            </w:pPr>
+            <w:r>
+              <w:rPr>
+                <w:rFonts w:hint="eastAsia"/>
+              </w:rPr>
+              <w:t>6</w:t>
+            </w:r>
           </w:p>
         </w:tc>
         <w:tc>
@@ -288,330 +417,17 @@
             <w:pPr>
               <w:cnfStyle w:val="000000000000" w:firstRow="0" w:lastRow="0" w:firstColumn="0" w:lastColumn="0" w:oddVBand="0" w:evenVBand="0" w:oddHBand="0" w:evenHBand="0" w:firstRowFirstColumn="0" w:firstRowLastColumn="0" w:lastRowFirstColumn="0" w:lastRowLastColumn="0"/>
             </w:pPr>
+            <w:r>
+              <w:rPr>
+                <w:rFonts w:hint="eastAsia"/>
+              </w:rPr>
+              <w:t>654</w:t>
+            </w:r>
           </w:p>
         </w:tc>
       </w:tr>
     </w:tbl>
     <w:p/>
-    <w:tbl>
-      <w:tblPr>
-        <w:tblStyle w:val="10"/>
-        <w:tblW w:w="0" w:type="auto"/>
-        <w:tblLook w:val="04A0" w:firstRow="1" w:lastRow="0" w:firstColumn="1" w:lastColumn="0" w:noHBand="0" w:noVBand="1"/>
-      </w:tblPr>
-      <w:tblGrid>
-        <w:gridCol w:w="1496"/>
-        <w:gridCol w:w="1496"/>
-        <w:gridCol w:w="1497"/>
-        <w:gridCol w:w="1497"/>
-        <w:gridCol w:w="1497"/>
-        <w:gridCol w:w="1497"/>
-      </w:tblGrid>
-      <w:tr>
-        <w:trPr>
-          <w:cnfStyle w:val="100000000000" w:firstRow="1" w:lastRow="0" w:firstColumn="0" w:lastColumn="0" w:oddVBand="0" w:evenVBand="0" w:oddHBand="0" w:evenHBand="0" w:firstRowFirstColumn="0" w:firstRowLastColumn="0" w:lastRowFirstColumn="0" w:lastRowLastColumn="0"/>
-        </w:trPr>
-        <w:tc>
-          <w:tcPr>
-            <w:cnfStyle w:val="001000000000" w:firstRow="0" w:lastRow="0" w:firstColumn="1" w:lastColumn="0" w:oddVBand="0" w:evenVBand="0" w:oddHBand="0" w:evenHBand="0" w:firstRowFirstColumn="0" w:firstRowLastColumn="0" w:lastRowFirstColumn="0" w:lastRowLastColumn="0"/>
-            <w:tcW w:w="1496" w:type="dxa"/>
-          </w:tcPr>
-          <w:p/>
-        </w:tc>
-        <w:tc>
-          <w:tcPr>
-            <w:tcW w:w="1496" w:type="dxa"/>
-          </w:tcPr>
-          <w:p>
-            <w:pPr>
-              <w:cnfStyle w:val="100000000000" w:firstRow="1" w:lastRow="0" w:firstColumn="0" w:lastColumn="0" w:oddVBand="0" w:evenVBand="0" w:oddHBand="0" w:evenHBand="0" w:firstRowFirstColumn="0" w:firstRowLastColumn="0" w:lastRowFirstColumn="0" w:lastRowLastColumn="0"/>
-            </w:pPr>
-          </w:p>
-        </w:tc>
-        <w:tc>
-          <w:tcPr>
-            <w:tcW w:w="1497" w:type="dxa"/>
-          </w:tcPr>
-          <w:p>
-            <w:pPr>
-              <w:cnfStyle w:val="100000000000" w:firstRow="1" w:lastRow="0" w:firstColumn="0" w:lastColumn="0" w:oddVBand="0" w:evenVBand="0" w:oddHBand="0" w:evenHBand="0" w:firstRowFirstColumn="0" w:firstRowLastColumn="0" w:lastRowFirstColumn="0" w:lastRowLastColumn="0"/>
-            </w:pPr>
-          </w:p>
-        </w:tc>
-        <w:tc>
-          <w:tcPr>
-            <w:tcW w:w="1497" w:type="dxa"/>
-          </w:tcPr>
-          <w:p>
-            <w:pPr>
-              <w:cnfStyle w:val="100000000000" w:firstRow="1" w:lastRow="0" w:firstColumn="0" w:lastColumn="0" w:oddVBand="0" w:evenVBand="0" w:oddHBand="0" w:evenHBand="0" w:firstRowFirstColumn="0" w:firstRowLastColumn="0" w:lastRowFirstColumn="0" w:lastRowLastColumn="0"/>
-            </w:pPr>
-          </w:p>
-        </w:tc>
-        <w:tc>
-          <w:tcPr>
-            <w:tcW w:w="1497" w:type="dxa"/>
-          </w:tcPr>
-          <w:p>
-            <w:pPr>
-              <w:cnfStyle w:val="100000000000" w:firstRow="1" w:lastRow="0" w:firstColumn="0" w:lastColumn="0" w:oddVBand="0" w:evenVBand="0" w:oddHBand="0" w:evenHBand="0" w:firstRowFirstColumn="0" w:firstRowLastColumn="0" w:lastRowFirstColumn="0" w:lastRowLastColumn="0"/>
-            </w:pPr>
-          </w:p>
-        </w:tc>
-        <w:tc>
-          <w:tcPr>
-            <w:tcW w:w="1497" w:type="dxa"/>
-          </w:tcPr>
-          <w:p>
-            <w:pPr>
-              <w:cnfStyle w:val="100000000000" w:firstRow="1" w:lastRow="0" w:firstColumn="0" w:lastColumn="0" w:oddVBand="0" w:evenVBand="0" w:oddHBand="0" w:evenHBand="0" w:firstRowFirstColumn="0" w:firstRowLastColumn="0" w:lastRowFirstColumn="0" w:lastRowLastColumn="0"/>
-            </w:pPr>
-          </w:p>
-        </w:tc>
-      </w:tr>
-      <w:tr>
-        <w:trPr>
-          <w:cnfStyle w:val="000000100000" w:firstRow="0" w:lastRow="0" w:firstColumn="0" w:lastColumn="0" w:oddVBand="0" w:evenVBand="0" w:oddHBand="1" w:evenHBand="0" w:firstRowFirstColumn="0" w:firstRowLastColumn="0" w:lastRowFirstColumn="0" w:lastRowLastColumn="0"/>
-        </w:trPr>
-        <w:tc>
-          <w:tcPr>
-            <w:cnfStyle w:val="001000000000" w:firstRow="0" w:lastRow="0" w:firstColumn="1" w:lastColumn="0" w:oddVBand="0" w:evenVBand="0" w:oddHBand="0" w:evenHBand="0" w:firstRowFirstColumn="0" w:firstRowLastColumn="0" w:lastRowFirstColumn="0" w:lastRowLastColumn="0"/>
-            <w:tcW w:w="1496" w:type="dxa"/>
-          </w:tcPr>
-          <w:p/>
-        </w:tc>
-        <w:tc>
-          <w:tcPr>
-            <w:tcW w:w="1496" w:type="dxa"/>
-          </w:tcPr>
-          <w:p>
-            <w:pPr>
-              <w:cnfStyle w:val="000000100000" w:firstRow="0" w:lastRow="0" w:firstColumn="0" w:lastColumn="0" w:oddVBand="0" w:evenVBand="0" w:oddHBand="1" w:evenHBand="0" w:firstRowFirstColumn="0" w:firstRowLastColumn="0" w:lastRowFirstColumn="0" w:lastRowLastColumn="0"/>
-            </w:pPr>
-          </w:p>
-        </w:tc>
-        <w:tc>
-          <w:tcPr>
-            <w:tcW w:w="1497" w:type="dxa"/>
-          </w:tcPr>
-          <w:p>
-            <w:pPr>
-              <w:cnfStyle w:val="000000100000" w:firstRow="0" w:lastRow="0" w:firstColumn="0" w:lastColumn="0" w:oddVBand="0" w:evenVBand="0" w:oddHBand="1" w:evenHBand="0" w:firstRowFirstColumn="0" w:firstRowLastColumn="0" w:lastRowFirstColumn="0" w:lastRowLastColumn="0"/>
-            </w:pPr>
-          </w:p>
-        </w:tc>
-        <w:tc>
-          <w:tcPr>
-            <w:tcW w:w="1497" w:type="dxa"/>
-          </w:tcPr>
-          <w:p>
-            <w:pPr>
-              <w:cnfStyle w:val="000000100000" w:firstRow="0" w:lastRow="0" w:firstColumn="0" w:lastColumn="0" w:oddVBand="0" w:evenVBand="0" w:oddHBand="1" w:evenHBand="0" w:firstRowFirstColumn="0" w:firstRowLastColumn="0" w:lastRowFirstColumn="0" w:lastRowLastColumn="0"/>
-            </w:pPr>
-          </w:p>
-        </w:tc>
-        <w:tc>
-          <w:tcPr>
-            <w:tcW w:w="1497" w:type="dxa"/>
-          </w:tcPr>
-          <w:p>
-            <w:pPr>
-              <w:cnfStyle w:val="000000100000" w:firstRow="0" w:lastRow="0" w:firstColumn="0" w:lastColumn="0" w:oddVBand="0" w:evenVBand="0" w:oddHBand="1" w:evenHBand="0" w:firstRowFirstColumn="0" w:firstRowLastColumn="0" w:lastRowFirstColumn="0" w:lastRowLastColumn="0"/>
-            </w:pPr>
-          </w:p>
-        </w:tc>
-        <w:tc>
-          <w:tcPr>
-            <w:tcW w:w="1497" w:type="dxa"/>
-          </w:tcPr>
-          <w:p>
-            <w:pPr>
-              <w:cnfStyle w:val="000000100000" w:firstRow="0" w:lastRow="0" w:firstColumn="0" w:lastColumn="0" w:oddVBand="0" w:evenVBand="0" w:oddHBand="1" w:evenHBand="0" w:firstRowFirstColumn="0" w:firstRowLastColumn="0" w:lastRowFirstColumn="0" w:lastRowLastColumn="0"/>
-            </w:pPr>
-          </w:p>
-        </w:tc>
-      </w:tr>
-      <w:tr>
-        <w:tc>
-          <w:tcPr>
-            <w:cnfStyle w:val="001000000000" w:firstRow="0" w:lastRow="0" w:firstColumn="1" w:lastColumn="0" w:oddVBand="0" w:evenVBand="0" w:oddHBand="0" w:evenHBand="0" w:firstRowFirstColumn="0" w:firstRowLastColumn="0" w:lastRowFirstColumn="0" w:lastRowLastColumn="0"/>
-            <w:tcW w:w="1496" w:type="dxa"/>
-          </w:tcPr>
-          <w:p/>
-        </w:tc>
-        <w:tc>
-          <w:tcPr>
-            <w:tcW w:w="1496" w:type="dxa"/>
-          </w:tcPr>
-          <w:p>
-            <w:pPr>
-              <w:cnfStyle w:val="000000000000" w:firstRow="0" w:lastRow="0" w:firstColumn="0" w:lastColumn="0" w:oddVBand="0" w:evenVBand="0" w:oddHBand="0" w:evenHBand="0" w:firstRowFirstColumn="0" w:firstRowLastColumn="0" w:lastRowFirstColumn="0" w:lastRowLastColumn="0"/>
-            </w:pPr>
-          </w:p>
-        </w:tc>
-        <w:tc>
-          <w:tcPr>
-            <w:tcW w:w="1497" w:type="dxa"/>
-          </w:tcPr>
-          <w:p>
-            <w:pPr>
-              <w:cnfStyle w:val="000000000000" w:firstRow="0" w:lastRow="0" w:firstColumn="0" w:lastColumn="0" w:oddVBand="0" w:evenVBand="0" w:oddHBand="0" w:evenHBand="0" w:firstRowFirstColumn="0" w:firstRowLastColumn="0" w:lastRowFirstColumn="0" w:lastRowLastColumn="0"/>
-            </w:pPr>
-          </w:p>
-        </w:tc>
-        <w:tc>
-          <w:tcPr>
-            <w:tcW w:w="1497" w:type="dxa"/>
-          </w:tcPr>
-          <w:p>
-            <w:pPr>
-              <w:cnfStyle w:val="000000000000" w:firstRow="0" w:lastRow="0" w:firstColumn="0" w:lastColumn="0" w:oddVBand="0" w:evenVBand="0" w:oddHBand="0" w:evenHBand="0" w:firstRowFirstColumn="0" w:firstRowLastColumn="0" w:lastRowFirstColumn="0" w:lastRowLastColumn="0"/>
-            </w:pPr>
-          </w:p>
-        </w:tc>
-        <w:tc>
-          <w:tcPr>
-            <w:tcW w:w="1497" w:type="dxa"/>
-          </w:tcPr>
-          <w:p>
-            <w:pPr>
-              <w:cnfStyle w:val="000000000000" w:firstRow="0" w:lastRow="0" w:firstColumn="0" w:lastColumn="0" w:oddVBand="0" w:evenVBand="0" w:oddHBand="0" w:evenHBand="0" w:firstRowFirstColumn="0" w:firstRowLastColumn="0" w:lastRowFirstColumn="0" w:lastRowLastColumn="0"/>
-            </w:pPr>
-          </w:p>
-        </w:tc>
-        <w:tc>
-          <w:tcPr>
-            <w:tcW w:w="1497" w:type="dxa"/>
-          </w:tcPr>
-          <w:p>
-            <w:pPr>
-              <w:cnfStyle w:val="000000000000" w:firstRow="0" w:lastRow="0" w:firstColumn="0" w:lastColumn="0" w:oddVBand="0" w:evenVBand="0" w:oddHBand="0" w:evenHBand="0" w:firstRowFirstColumn="0" w:firstRowLastColumn="0" w:lastRowFirstColumn="0" w:lastRowLastColumn="0"/>
-            </w:pPr>
-          </w:p>
-        </w:tc>
-      </w:tr>
-      <w:tr>
-        <w:trPr>
-          <w:cnfStyle w:val="000000100000" w:firstRow="0" w:lastRow="0" w:firstColumn="0" w:lastColumn="0" w:oddVBand="0" w:evenVBand="0" w:oddHBand="1" w:evenHBand="0" w:firstRowFirstColumn="0" w:firstRowLastColumn="0" w:lastRowFirstColumn="0" w:lastRowLastColumn="0"/>
-        </w:trPr>
-        <w:tc>
-          <w:tcPr>
-            <w:cnfStyle w:val="001000000000" w:firstRow="0" w:lastRow="0" w:firstColumn="1" w:lastColumn="0" w:oddVBand="0" w:evenVBand="0" w:oddHBand="0" w:evenHBand="0" w:firstRowFirstColumn="0" w:firstRowLastColumn="0" w:lastRowFirstColumn="0" w:lastRowLastColumn="0"/>
-            <w:tcW w:w="1496" w:type="dxa"/>
-          </w:tcPr>
-          <w:p/>
-        </w:tc>
-        <w:tc>
-          <w:tcPr>
-            <w:tcW w:w="1496" w:type="dxa"/>
-          </w:tcPr>
-          <w:p>
-            <w:pPr>
-              <w:cnfStyle w:val="000000100000" w:firstRow="0" w:lastRow="0" w:firstColumn="0" w:lastColumn="0" w:oddVBand="0" w:evenVBand="0" w:oddHBand="1" w:evenHBand="0" w:firstRowFirstColumn="0" w:firstRowLastColumn="0" w:lastRowFirstColumn="0" w:lastRowLastColumn="0"/>
-            </w:pPr>
-          </w:p>
-        </w:tc>
-        <w:tc>
-          <w:tcPr>
-            <w:tcW w:w="1497" w:type="dxa"/>
-          </w:tcPr>
-          <w:p>
-            <w:pPr>
-              <w:cnfStyle w:val="000000100000" w:firstRow="0" w:lastRow="0" w:firstColumn="0" w:lastColumn="0" w:oddVBand="0" w:evenVBand="0" w:oddHBand="1" w:evenHBand="0" w:firstRowFirstColumn="0" w:firstRowLastColumn="0" w:lastRowFirstColumn="0" w:lastRowLastColumn="0"/>
-            </w:pPr>
-          </w:p>
-        </w:tc>
-        <w:tc>
-          <w:tcPr>
-            <w:tcW w:w="1497" w:type="dxa"/>
-          </w:tcPr>
-          <w:p>
-            <w:pPr>
-              <w:cnfStyle w:val="000000100000" w:firstRow="0" w:lastRow="0" w:firstColumn="0" w:lastColumn="0" w:oddVBand="0" w:evenVBand="0" w:oddHBand="1" w:evenHBand="0" w:firstRowFirstColumn="0" w:firstRowLastColumn="0" w:lastRowFirstColumn="0" w:lastRowLastColumn="0"/>
-            </w:pPr>
-          </w:p>
-        </w:tc>
-        <w:tc>
-          <w:tcPr>
-            <w:tcW w:w="1497" w:type="dxa"/>
-          </w:tcPr>
-          <w:p>
-            <w:pPr>
-              <w:cnfStyle w:val="000000100000" w:firstRow="0" w:lastRow="0" w:firstColumn="0" w:lastColumn="0" w:oddVBand="0" w:evenVBand="0" w:oddHBand="1" w:evenHBand="0" w:firstRowFirstColumn="0" w:firstRowLastColumn="0" w:lastRowFirstColumn="0" w:lastRowLastColumn="0"/>
-            </w:pPr>
-          </w:p>
-        </w:tc>
-        <w:tc>
-          <w:tcPr>
-            <w:tcW w:w="1497" w:type="dxa"/>
-          </w:tcPr>
-          <w:p>
-            <w:pPr>
-              <w:cnfStyle w:val="000000100000" w:firstRow="0" w:lastRow="0" w:firstColumn="0" w:lastColumn="0" w:oddVBand="0" w:evenVBand="0" w:oddHBand="1" w:evenHBand="0" w:firstRowFirstColumn="0" w:firstRowLastColumn="0" w:lastRowFirstColumn="0" w:lastRowLastColumn="0"/>
-            </w:pPr>
-          </w:p>
-        </w:tc>
-      </w:tr>
-      <w:tr>
-        <w:tc>
-          <w:tcPr>
-            <w:cnfStyle w:val="001000000000" w:firstRow="0" w:lastRow="0" w:firstColumn="1" w:lastColumn="0" w:oddVBand="0" w:evenVBand="0" w:oddHBand="0" w:evenHBand="0" w:firstRowFirstColumn="0" w:firstRowLastColumn="0" w:lastRowFirstColumn="0" w:lastRowLastColumn="0"/>
-            <w:tcW w:w="1496" w:type="dxa"/>
-          </w:tcPr>
-          <w:p/>
-        </w:tc>
-        <w:tc>
-          <w:tcPr>
-            <w:tcW w:w="1496" w:type="dxa"/>
-          </w:tcPr>
-          <w:p>
-            <w:pPr>
-              <w:cnfStyle w:val="000000000000" w:firstRow="0" w:lastRow="0" w:firstColumn="0" w:lastColumn="0" w:oddVBand="0" w:evenVBand="0" w:oddHBand="0" w:evenHBand="0" w:firstRowFirstColumn="0" w:firstRowLastColumn="0" w:lastRowFirstColumn="0" w:lastRowLastColumn="0"/>
-            </w:pPr>
-          </w:p>
-        </w:tc>
-        <w:tc>
-          <w:tcPr>
-            <w:tcW w:w="1497" w:type="dxa"/>
-          </w:tcPr>
-          <w:p>
-            <w:pPr>
-              <w:cnfStyle w:val="000000000000" w:firstRow="0" w:lastRow="0" w:firstColumn="0" w:lastColumn="0" w:oddVBand="0" w:evenVBand="0" w:oddHBand="0" w:evenHBand="0" w:firstRowFirstColumn="0" w:firstRowLastColumn="0" w:lastRowFirstColumn="0" w:lastRowLastColumn="0"/>
-            </w:pPr>
-          </w:p>
-        </w:tc>
-        <w:tc>
-          <w:tcPr>
-            <w:tcW w:w="1497" w:type="dxa"/>
-          </w:tcPr>
-          <w:p>
-            <w:pPr>
-              <w:cnfStyle w:val="000000000000" w:firstRow="0" w:lastRow="0" w:firstColumn="0" w:lastColumn="0" w:oddVBand="0" w:evenVBand="0" w:oddHBand="0" w:evenHBand="0" w:firstRowFirstColumn="0" w:firstRowLastColumn="0" w:lastRowFirstColumn="0" w:lastRowLastColumn="0"/>
-            </w:pPr>
-          </w:p>
-        </w:tc>
-        <w:tc>
-          <w:tcPr>
-            <w:tcW w:w="1497" w:type="dxa"/>
-          </w:tcPr>
-          <w:p>
-            <w:pPr>
-              <w:cnfStyle w:val="000000000000" w:firstRow="0" w:lastRow="0" w:firstColumn="0" w:lastColumn="0" w:oddVBand="0" w:evenVBand="0" w:oddHBand="0" w:evenHBand="0" w:firstRowFirstColumn="0" w:firstRowLastColumn="0" w:lastRowFirstColumn="0" w:lastRowLastColumn="0"/>
-            </w:pPr>
-          </w:p>
-        </w:tc>
-        <w:tc>
-          <w:tcPr>
-            <w:tcW w:w="1497" w:type="dxa"/>
-          </w:tcPr>
-          <w:p>
-            <w:pPr>
-              <w:cnfStyle w:val="000000000000" w:firstRow="0" w:lastRow="0" w:firstColumn="0" w:lastColumn="0" w:oddVBand="0" w:evenVBand="0" w:oddHBand="0" w:evenHBand="0" w:firstRowFirstColumn="0" w:firstRowLastColumn="0" w:lastRowFirstColumn="0" w:lastRowLastColumn="0"/>
-            </w:pPr>
-          </w:p>
-        </w:tc>
-      </w:tr>
-    </w:tbl>
     <w:p/>
     <w:sectPr>
       <w:pgSz w:w="11906" w:h="16838"/>
@@ -678,7 +494,7 @@
   <w:abstractNum w:abstractNumId="0" w15:restartNumberingAfterBreak="0">
     <w:nsid w:val="076A2DCB"/>
     <w:multiLevelType w:val="multilevel"/>
-    <w:tmpl w:val="F412D72E"/>
+    <w:tmpl w:val="9F8C45C2"/>
     <w:lvl w:ilvl="0">
       <w:start w:val="1"/>
       <w:numFmt w:val="decimal"/>
@@ -1335,7 +1151,7 @@
     <w:link w:val="1Char"/>
     <w:uiPriority w:val="9"/>
     <w:qFormat/>
-    <w:rsid w:val="00776CC5"/>
+    <w:rsid w:val="006A61FF"/>
     <w:pPr>
       <w:numPr>
         <w:numId w:val="2"/>
@@ -1343,6 +1159,12 @@
       <w:jc w:val="center"/>
       <w:outlineLvl w:val="0"/>
     </w:pPr>
+    <w:rPr>
+      <w:b/>
+      <w:bCs/>
+      <w:sz w:val="28"/>
+      <w:szCs w:val="32"/>
+    </w:rPr>
   </w:style>
   <w:style w:type="paragraph" w:styleId="2">
     <w:name w:val="heading 2"/>
@@ -1352,7 +1174,7 @@
     <w:uiPriority w:val="9"/>
     <w:unhideWhenUsed/>
     <w:qFormat/>
-    <w:rsid w:val="00776CC5"/>
+    <w:rsid w:val="00BE3CA9"/>
     <w:pPr>
       <w:numPr>
         <w:ilvl w:val="1"/>
@@ -1370,7 +1192,7 @@
     <w:uiPriority w:val="9"/>
     <w:unhideWhenUsed/>
     <w:qFormat/>
-    <w:rsid w:val="00776CC5"/>
+    <w:rsid w:val="00BE3CA9"/>
     <w:pPr>
       <w:numPr>
         <w:ilvl w:val="2"/>
@@ -1388,7 +1210,7 @@
     <w:uiPriority w:val="9"/>
     <w:unhideWhenUsed/>
     <w:qFormat/>
-    <w:rsid w:val="0005123F"/>
+    <w:rsid w:val="00297BA2"/>
     <w:pPr>
       <w:numPr>
         <w:ilvl w:val="3"/>
@@ -1396,6 +1218,9 @@
       </w:numPr>
       <w:outlineLvl w:val="3"/>
     </w:pPr>
+    <w:rPr>
+      <w:color w:val="EE0000"/>
+    </w:rPr>
   </w:style>
   <w:style w:type="paragraph" w:styleId="5">
     <w:name w:val="heading 5"/>
@@ -1405,7 +1230,7 @@
     <w:uiPriority w:val="9"/>
     <w:unhideWhenUsed/>
     <w:qFormat/>
-    <w:rsid w:val="0005123F"/>
+    <w:rsid w:val="00BE3CA9"/>
     <w:pPr>
       <w:numPr>
         <w:ilvl w:val="4"/>
@@ -1421,7 +1246,7 @@
     <w:uiPriority w:val="9"/>
     <w:unhideWhenUsed/>
     <w:qFormat/>
-    <w:rsid w:val="0005123F"/>
+    <w:rsid w:val="00BE3CA9"/>
     <w:pPr>
       <w:keepNext/>
       <w:keepLines/>
@@ -1535,42 +1360,51 @@
     <w:basedOn w:val="a0"/>
     <w:link w:val="1"/>
     <w:uiPriority w:val="9"/>
-    <w:rsid w:val="00776CC5"/>
+    <w:rsid w:val="006A61FF"/>
+    <w:rPr>
+      <w:b/>
+      <w:bCs/>
+      <w:sz w:val="28"/>
+      <w:szCs w:val="32"/>
+    </w:rPr>
   </w:style>
   <w:style w:type="character" w:customStyle="1" w:styleId="2Char">
     <w:name w:val="제목 2 Char"/>
     <w:basedOn w:val="a0"/>
     <w:link w:val="2"/>
     <w:uiPriority w:val="9"/>
-    <w:rsid w:val="00776CC5"/>
+    <w:rsid w:val="00BE3CA9"/>
   </w:style>
   <w:style w:type="character" w:customStyle="1" w:styleId="3Char">
     <w:name w:val="제목 3 Char"/>
     <w:basedOn w:val="a0"/>
     <w:link w:val="3"/>
     <w:uiPriority w:val="9"/>
-    <w:rsid w:val="00776CC5"/>
+    <w:rsid w:val="00BE3CA9"/>
   </w:style>
   <w:style w:type="character" w:customStyle="1" w:styleId="4Char">
     <w:name w:val="제목 4 Char"/>
     <w:basedOn w:val="a0"/>
     <w:link w:val="4"/>
     <w:uiPriority w:val="9"/>
-    <w:rsid w:val="00776CC5"/>
+    <w:rsid w:val="00297BA2"/>
+    <w:rPr>
+      <w:color w:val="EE0000"/>
+    </w:rPr>
   </w:style>
   <w:style w:type="character" w:customStyle="1" w:styleId="5Char">
     <w:name w:val="제목 5 Char"/>
     <w:basedOn w:val="a0"/>
     <w:link w:val="5"/>
     <w:uiPriority w:val="9"/>
-    <w:rsid w:val="0005123F"/>
+    <w:rsid w:val="00BE3CA9"/>
   </w:style>
   <w:style w:type="character" w:customStyle="1" w:styleId="6Char">
     <w:name w:val="제목 6 Char"/>
     <w:basedOn w:val="a0"/>
     <w:link w:val="6"/>
     <w:uiPriority w:val="9"/>
-    <w:rsid w:val="0005123F"/>
+    <w:rsid w:val="00BE3CA9"/>
     <w:rPr>
       <w:rFonts w:asciiTheme="majorHAnsi" w:eastAsiaTheme="majorEastAsia" w:hAnsiTheme="majorHAnsi" w:cstheme="majorBidi"/>
       <w:color w:val="000000" w:themeColor="text1"/>
@@ -1789,23 +1623,28 @@
     <w:name w:val="Table Grid"/>
     <w:basedOn w:val="a1"/>
     <w:uiPriority w:val="39"/>
-    <w:rsid w:val="008168FD"/>
+    <w:rsid w:val="00FC5458"/>
     <w:pPr>
       <w:spacing w:after="0"/>
+      <w:jc w:val="center"/>
     </w:pPr>
     <w:tblPr>
       <w:tblBorders>
-        <w:top w:val="single" w:sz="18" w:space="0" w:color="000000" w:themeColor="text1"/>
-        <w:left w:val="single" w:sz="18" w:space="0" w:color="000000" w:themeColor="text1"/>
-        <w:bottom w:val="single" w:sz="18" w:space="0" w:color="000000" w:themeColor="text1"/>
-        <w:right w:val="single" w:sz="18" w:space="0" w:color="000000" w:themeColor="text1"/>
-        <w:insideH w:val="single" w:sz="18" w:space="0" w:color="000000" w:themeColor="text1"/>
-        <w:insideV w:val="single" w:sz="18" w:space="0" w:color="000000" w:themeColor="text1"/>
+        <w:top w:val="single" w:sz="8" w:space="0" w:color="000000" w:themeColor="text1"/>
+        <w:left w:val="single" w:sz="8" w:space="0" w:color="000000" w:themeColor="text1"/>
+        <w:bottom w:val="single" w:sz="8" w:space="0" w:color="000000" w:themeColor="text1"/>
+        <w:right w:val="single" w:sz="8" w:space="0" w:color="000000" w:themeColor="text1"/>
+        <w:insideH w:val="single" w:sz="8" w:space="0" w:color="000000" w:themeColor="text1"/>
+        <w:insideV w:val="single" w:sz="8" w:space="0" w:color="000000" w:themeColor="text1"/>
       </w:tblBorders>
     </w:tblPr>
+    <w:tcPr>
+      <w:vAlign w:val="center"/>
+    </w:tcPr>
     <w:tblStylePr w:type="firstRow">
       <w:pPr>
         <w:wordWrap/>
+        <w:jc w:val="center"/>
       </w:pPr>
       <w:rPr>
         <w:rFonts w:asciiTheme="majorHAnsi" w:eastAsiaTheme="majorEastAsia" w:hAnsiTheme="majorHAnsi"/>
@@ -1817,12 +1656,20 @@
       <w:tblPr/>
       <w:tcPr>
         <w:shd w:val="clear" w:color="auto" w:fill="D9D9D9" w:themeFill="background1" w:themeFillShade="D9"/>
+        <w:vAlign w:val="center"/>
       </w:tcPr>
     </w:tblStylePr>
     <w:tblStylePr w:type="firstCol">
+      <w:pPr>
+        <w:jc w:val="center"/>
+      </w:pPr>
+      <w:rPr>
+        <w:b/>
+      </w:rPr>
       <w:tblPr/>
       <w:tcPr>
         <w:shd w:val="clear" w:color="auto" w:fill="C1E4F5" w:themeFill="accent1" w:themeFillTint="33"/>
+        <w:vAlign w:val="center"/>
       </w:tcPr>
     </w:tblStylePr>
   </w:style>
@@ -1932,6 +1779,43 @@
     <w:link w:val="ac"/>
     <w:uiPriority w:val="99"/>
     <w:rsid w:val="006C70CA"/>
+  </w:style>
+  <w:style w:type="table" w:customStyle="1" w:styleId="Table">
+    <w:name w:val="Table"/>
+    <w:basedOn w:val="aa"/>
+    <w:uiPriority w:val="39"/>
+    <w:tblPr/>
+    <w:tblStylePr w:type="firstRow">
+      <w:pPr>
+        <w:wordWrap/>
+        <w:jc w:val="center"/>
+      </w:pPr>
+      <w:rPr>
+        <w:rFonts w:asciiTheme="majorHAnsi" w:eastAsiaTheme="majorEastAsia" w:hAnsiTheme="majorHAnsi"/>
+        <w:b/>
+        <w:i w:val="0"/>
+        <w:color w:val="000000" w:themeColor="text1"/>
+        <w:sz w:val="24"/>
+      </w:rPr>
+      <w:tblPr/>
+      <w:tcPr>
+        <w:shd w:val="clear" w:color="auto" w:fill="D9D9D9" w:themeFill="background1" w:themeFillShade="D9"/>
+        <w:vAlign w:val="center"/>
+      </w:tcPr>
+    </w:tblStylePr>
+    <w:tblStylePr w:type="firstCol">
+      <w:pPr>
+        <w:jc w:val="center"/>
+      </w:pPr>
+      <w:rPr>
+        <w:b/>
+      </w:rPr>
+      <w:tblPr/>
+      <w:tcPr>
+        <w:shd w:val="clear" w:color="auto" w:fill="C1E4F5" w:themeFill="accent1" w:themeFillTint="33"/>
+        <w:vAlign w:val="center"/>
+      </w:tcPr>
+    </w:tblStylePr>
   </w:style>
 </w:styles>
 </file>

</xml_diff>